<commit_message>
Update Pandoc documentation and Lua filters; add new reference files and enhance task configurations
</commit_message>
<xml_diff>
--- a/docx/tool_pandoc_lua.docx
+++ b/docx/tool_pandoc_lua.docx
@@ -3614,7 +3614,7 @@
     </w:p>
     <w:bookmarkEnd w:id="120"/>
     <w:bookmarkEnd w:id="121"/>
-    <w:bookmarkStart w:id="135" w:name="lua-filter"/>
+    <w:bookmarkStart w:id="139" w:name="lua-filter"/>
     <w:p>
       <w:pPr>
         <w:pStyle w:val="2"/>
@@ -3821,7 +3821,7 @@
           <w:b/>
           <w:bCs/>
         </w:rPr>
-        <w:t xml:space="preserve">Markdown에서 사용하는 것을 피하는 것</w:t>
+        <w:t xml:space="preserve">Markdown에서 사용하는 인식자/구분자 중복을 피하는 것</w:t>
       </w:r>
       <w:r>
         <w:t xml:space="preserve"> </w:t>
@@ -3837,7 +3837,48 @@
     </w:p>
     <w:p>
       <w:pPr>
-        <w:pStyle w:val="a0"/>
+        <w:pStyle w:val="a8"/>
+      </w:pPr>
+      <w:r>
+        <w:rPr>
+          <w:b/>
+          <w:bCs/>
+        </w:rPr>
+        <w:t xml:space="preserve">DOCX</w:t>
+      </w:r>
+    </w:p>
+    <w:p>
+      <w:pPr>
+        <w:pStyle w:val="a8"/>
+      </w:pPr>
+      <w:r>
+        <w:rPr>
+          <w:b/>
+          <w:bCs/>
+        </w:rPr>
+        <w:t xml:space="preserve">아래의 예제는 DOCX 기준이나 HTML 기준으로 작성할 수 있다.</w:t>
+      </w:r>
+    </w:p>
+    <w:p>
+      <w:pPr>
+        <w:pStyle w:val="FirstParagraph"/>
+      </w:pPr>
+    </w:p>
+    <w:p>
+      <w:pPr>
+        <w:pStyle w:val="a8"/>
+      </w:pPr>
+      <w:r>
+        <w:rPr>
+          <w:b/>
+          <w:bCs/>
+        </w:rPr>
+        <w:t xml:space="preserve">HTML</w:t>
+      </w:r>
+    </w:p>
+    <w:p>
+      <w:pPr>
+        <w:pStyle w:val="a8"/>
       </w:pPr>
       <w:r>
         <w:t xml:space="preserve">Lua Filter Script을 보면 div 기반으로 사용하므로, DOCX가 아니라면,</w:t>
@@ -3851,7 +3892,7 @@
     </w:p>
     <w:p>
       <w:pPr>
-        <w:pStyle w:val="a0"/>
+        <w:pStyle w:val="FirstParagraph"/>
       </w:pPr>
     </w:p>
     <w:bookmarkStart w:id="128" w:name="lua-filter-script-a"/>
@@ -4111,6 +4152,22 @@
         </w:rPr>
         <w:t xml:space="preserve">즉 yaml 정보파일 (Metafile은 YAML로 이용) 과 정보 image path 이용</w:t>
       </w:r>
+      <w:r>
+        <w:br/>
+      </w:r>
+      <w:r>
+        <w:rPr>
+          <w:b/>
+          <w:bCs/>
+        </w:rPr>
+        <w:t xml:space="preserve">yaml 내의 이미지 위치 PATH는 반드시 Project 기반</w:t>
+      </w:r>
+      <w:r>
+        <w:t xml:space="preserve"> </w:t>
+      </w:r>
+      <w:r>
+        <w:t xml:space="preserve">이유는 Task에서 실행하기 때문에</w:t>
+      </w:r>
     </w:p>
     <w:p>
       <w:pPr>
@@ -4126,6 +4183,10 @@
         </w:numPr>
       </w:pPr>
       <w:r>
+        <w:rPr>
+          <w:b/>
+          <w:bCs/>
+        </w:rPr>
         <w:t xml:space="preserve">docx/tool_pandoc_lua.docx</w:t>
       </w:r>
       <w:r>
@@ -4342,6 +4403,22 @@
       <w:r>
         <w:t xml:space="preserve">간단히 lua filter만 이용하여 외부파일 읽기</w:t>
       </w:r>
+      <w:r>
+        <w:br/>
+      </w:r>
+      <w:r>
+        <w:rPr>
+          <w:b/>
+          <w:bCs/>
+        </w:rPr>
+        <w:t xml:space="preserve">.gitignore 파일의 위치 PATH는 반드시 Project 기반</w:t>
+      </w:r>
+      <w:r>
+        <w:t xml:space="preserve"> </w:t>
+      </w:r>
+      <w:r>
+        <w:t xml:space="preserve">이유는 Task에서 실행하기 때문에</w:t>
+      </w:r>
     </w:p>
     <w:p>
       <w:pPr>
@@ -4357,6 +4434,10 @@
         </w:numPr>
       </w:pPr>
       <w:r>
+        <w:rPr>
+          <w:b/>
+          <w:bCs/>
+        </w:rPr>
         <w:t xml:space="preserve">docx/tool_pandoc_lua.docx</w:t>
       </w:r>
       <w:r>
@@ -4427,7 +4508,7 @@
       </w:pPr>
     </w:p>
     <w:bookmarkEnd w:id="132"/>
-    <w:bookmarkStart w:id="133" w:name="lua-filter-script-c"/>
+    <w:bookmarkStart w:id="136" w:name="lua-filter-script-c"/>
     <w:p>
       <w:pPr>
         <w:pStyle w:val="3"/>
@@ -4704,31 +4785,8 @@
         <w:pStyle w:val="a8"/>
       </w:pPr>
       <w:r>
-        <w:t xml:space="preserve">상위 구분자 와 information.lua</w:t>
-      </w:r>
-      <w:r>
-        <w:br/>
-      </w:r>
-      <w:r>
-        <w:t xml:space="preserve">1. test_result.json</w:t>
-      </w:r>
-      <w:r>
-        <w:t xml:space="preserve"> </w:t>
-      </w:r>
-      <w:r>
-        <w:t xml:space="preserve">2. test_result.lua</w:t>
-      </w:r>
-      <w:r>
-        <w:t xml:space="preserve"> </w:t>
-      </w:r>
-      <w:r>
-        <w:t xml:space="preserve">간단히 lua filter만 이용하여 외부파일 읽기</w:t>
-      </w:r>
-    </w:p>
-    <w:p>
-      <w:pPr>
-        <w:pStyle w:val="FirstParagraph"/>
-      </w:pPr>
+        <w:t xml:space="preserve">상위 구분자 와 test_result.lua</w:t>
+      </w:r>
     </w:p>
     <w:p>
       <w:pPr>
@@ -4739,50 +4797,54 @@
         </w:numPr>
       </w:pPr>
       <w:r>
-        <w:t xml:space="preserve">docx/tool_pandoc_lua.docx</w:t>
-      </w:r>
-      <w:r>
-        <w:br/>
-      </w:r>
-      <w:r>
         <w:rPr>
           <w:b/>
           <w:bCs/>
         </w:rPr>
-        <w:t xml:space="preserve">pandoc result</w:t>
+        <w:t xml:space="preserve">test_result.json</w:t>
+      </w:r>
+      <w:r>
+        <w:br/>
+      </w:r>
+    </w:p>
+    <w:p>
+      <w:pPr>
+        <w:pStyle w:val="Compact"/>
+        <w:numPr>
+          <w:ilvl w:val="0"/>
+          <w:numId w:val="1048"/>
+        </w:numPr>
+      </w:pPr>
+      <w:r>
+        <w:rPr>
+          <w:b/>
+          <w:bCs/>
+        </w:rPr>
+        <w:t xml:space="preserve">test_result.lua</w:t>
+      </w:r>
+    </w:p>
+    <w:p>
+      <w:pPr>
+        <w:pStyle w:val="a8"/>
+      </w:pPr>
+      <w:r>
+        <w:t xml:space="preserve">Json 파일을 읽어서, lua filter로 처리하여, Table 생성</w:t>
+      </w:r>
+      <w:r>
+        <w:br/>
+      </w:r>
+      <w:r>
+        <w:rPr>
+          <w:b/>
+          <w:bCs/>
+        </w:rPr>
+        <w:t xml:space="preserve">json 파일의 위치 PATH는 반드시 Project 기반</w:t>
       </w:r>
       <w:r>
         <w:t xml:space="preserve"> </w:t>
       </w:r>
       <w:r>
-        <w:t xml:space="preserve">// pandoc 실행 결과</w:t>
-      </w:r>
-      <w:r>
-        <w:t xml:space="preserve"> </w:t>
-      </w:r>
-    </w:p>
-    <w:p>
-      <w:pPr>
-        <w:pStyle w:val="FirstParagraph"/>
-      </w:pPr>
-    </w:p>
-    <w:bookmarkEnd w:id="133"/>
-    <w:bookmarkStart w:id="134" w:name="pandoc-args"/>
-    <w:p>
-      <w:pPr>
-        <w:pStyle w:val="3"/>
-      </w:pPr>
-      <w:r>
-        <w:rPr>
-          <w:rStyle w:val="SectionNumber"/>
-        </w:rPr>
-        <w:t xml:space="preserve">7.4</w:t>
-      </w:r>
-      <w:r>
-        <w:tab/>
-      </w:r>
-      <w:r>
-        <w:t xml:space="preserve">Pandoc Args</w:t>
+        <w:t xml:space="preserve">이유는 Task에서 실행하기 때문에</w:t>
       </w:r>
     </w:p>
     <w:p>
@@ -4803,6 +4865,638 @@
           <w:b/>
           <w:bCs/>
         </w:rPr>
+        <w:t xml:space="preserve">docx/tool_pandoc_lua.docx</w:t>
+      </w:r>
+      <w:r>
+        <w:br/>
+      </w:r>
+      <w:r>
+        <w:rPr>
+          <w:b/>
+          <w:bCs/>
+        </w:rPr>
+        <w:t xml:space="preserve">pandoc result</w:t>
+      </w:r>
+      <w:r>
+        <w:t xml:space="preserve"> </w:t>
+      </w:r>
+      <w:r>
+        <w:t xml:space="preserve">// pandoc 실행 결과 (test_result.lua/test_result.json)</w:t>
+      </w:r>
+      <w:r>
+        <w:br/>
+      </w:r>
+      <w:r>
+        <w:drawing>
+          <wp:inline>
+            <wp:extent cx="5943600" cy="3344287"/>
+            <wp:effectExtent b="0" l="0" r="0" t="0"/>
+            <wp:docPr descr="" title="" id="134" name="Picture"/>
+            <a:graphic>
+              <a:graphicData uri="http://schemas.openxmlformats.org/drawingml/2006/picture">
+                <pic:pic>
+                  <pic:nvPicPr>
+                    <pic:cNvPr descr="./imgs/pandoc_docx_18.png" id="135" name="Picture"/>
+                    <pic:cNvPicPr>
+                      <a:picLocks noChangeArrowheads="1" noChangeAspect="1"/>
+                    </pic:cNvPicPr>
+                  </pic:nvPicPr>
+                  <pic:blipFill>
+                    <a:blip r:embed="rId133"/>
+                    <a:stretch>
+                      <a:fillRect/>
+                    </a:stretch>
+                  </pic:blipFill>
+                  <pic:spPr bwMode="auto">
+                    <a:xfrm>
+                      <a:off x="0" y="0"/>
+                      <a:ext cx="5943600" cy="3344287"/>
+                    </a:xfrm>
+                    <a:prstGeom prst="rect">
+                      <a:avLst/>
+                    </a:prstGeom>
+                    <a:noFill/>
+                    <a:ln w="9525">
+                      <a:noFill/>
+                      <a:headEnd/>
+                      <a:tailEnd/>
+                    </a:ln>
+                  </pic:spPr>
+                </pic:pic>
+              </a:graphicData>
+            </a:graphic>
+          </wp:inline>
+        </w:drawing>
+      </w:r>
+    </w:p>
+    <w:p>
+      <w:pPr>
+        <w:pStyle w:val="FirstParagraph"/>
+      </w:pPr>
+    </w:p>
+    <w:bookmarkEnd w:id="136"/>
+    <w:bookmarkStart w:id="137" w:name="lua-filter-script-d"/>
+    <w:p>
+      <w:pPr>
+        <w:pStyle w:val="3"/>
+      </w:pPr>
+      <w:r>
+        <w:rPr>
+          <w:rStyle w:val="SectionNumber"/>
+        </w:rPr>
+        <w:t xml:space="preserve">7.4</w:t>
+      </w:r>
+      <w:r>
+        <w:tab/>
+      </w:r>
+      <w:r>
+        <w:t xml:space="preserve">Lua Filter Script-D</w:t>
+      </w:r>
+    </w:p>
+    <w:p>
+      <w:pPr>
+        <w:pStyle w:val="FirstParagraph"/>
+      </w:pPr>
+    </w:p>
+    <w:p>
+      <w:pPr>
+        <w:pStyle w:val="a8"/>
+      </w:pPr>
+      <w:r>
+        <w:t xml:space="preserve">table-width.lua 이용하여 각 width를 세부적으로 조절</w:t>
+      </w:r>
+      <w:r>
+        <w:t xml:space="preserve"> </w:t>
+      </w:r>
+      <w:r>
+        <w:t xml:space="preserve">이 방법 말고 별도로</w:t>
+      </w:r>
+    </w:p>
+    <w:p>
+      <w:pPr>
+        <w:pStyle w:val="Compact"/>
+        <w:numPr>
+          <w:ilvl w:val="0"/>
+          <w:numId w:val="1050"/>
+        </w:numPr>
+      </w:pPr>
+      <w:r>
+        <w:t xml:space="preserve">TEST Table Size Lua Filter로 조절</w:t>
+      </w:r>
+    </w:p>
+    <w:tbl>
+      <w:tblPr>
+        <w:tblStyle w:val="Table"/>
+        <w:tblW w:type="auto" w:w="0"/>
+        <w:tblLook w:firstRow="1" w:lastRow="0" w:firstColumn="0" w:lastColumn="0" w:noHBand="0" w:noVBand="0" w:val="0020"/>
+      </w:tblPr>
+      <w:tblGrid>
+        <w:gridCol w:w="2640"/>
+        <w:gridCol w:w="2640"/>
+        <w:gridCol w:w="2640"/>
+      </w:tblGrid>
+      <w:tr>
+        <w:trPr>
+          <w:tblHeader w:val="on"/>
+        </w:trPr>
+        <w:tc>
+          <w:tcPr/>
+          <w:p>
+            <w:pPr>
+              <w:pStyle w:val="Compact"/>
+            </w:pPr>
+            <w:r>
+              <w:t xml:space="preserve">구분</w:t>
+            </w:r>
+          </w:p>
+        </w:tc>
+        <w:tc>
+          <w:tcPr/>
+          <w:p>
+            <w:pPr>
+              <w:pStyle w:val="Compact"/>
+            </w:pPr>
+            <w:r>
+              <w:t xml:space="preserve">A</w:t>
+            </w:r>
+          </w:p>
+        </w:tc>
+        <w:tc>
+          <w:tcPr/>
+          <w:p>
+            <w:pPr>
+              <w:pStyle w:val="Compact"/>
+            </w:pPr>
+            <w:r>
+              <w:t xml:space="preserve">B</w:t>
+            </w:r>
+          </w:p>
+        </w:tc>
+      </w:tr>
+      <w:tr>
+        <w:tc>
+          <w:tcPr/>
+          <w:p>
+            <w:pPr>
+              <w:pStyle w:val="Compact"/>
+            </w:pPr>
+            <w:r>
+              <w:t xml:space="preserve">1</w:t>
+            </w:r>
+          </w:p>
+        </w:tc>
+        <w:tc>
+          <w:tcPr/>
+          <w:p>
+            <w:pPr>
+              <w:pStyle w:val="Compact"/>
+            </w:pPr>
+            <w:r>
+              <w:t xml:space="preserve">A.1</w:t>
+            </w:r>
+          </w:p>
+        </w:tc>
+        <w:tc>
+          <w:tcPr/>
+          <w:p>
+            <w:pPr>
+              <w:pStyle w:val="Compact"/>
+            </w:pPr>
+            <w:r>
+              <w:t xml:space="preserve">A.1</w:t>
+            </w:r>
+          </w:p>
+        </w:tc>
+      </w:tr>
+      <w:tr>
+        <w:tc>
+          <w:tcPr/>
+          <w:p>
+            <w:pPr>
+              <w:pStyle w:val="Compact"/>
+            </w:pPr>
+            <w:r>
+              <w:t xml:space="preserve">2</w:t>
+            </w:r>
+          </w:p>
+        </w:tc>
+        <w:tc>
+          <w:tcPr/>
+          <w:p>
+            <w:pPr>
+              <w:pStyle w:val="Compact"/>
+            </w:pPr>
+            <w:r>
+              <w:t xml:space="preserve">A.2</w:t>
+            </w:r>
+          </w:p>
+        </w:tc>
+        <w:tc>
+          <w:tcPr/>
+          <w:p>
+            <w:pPr>
+              <w:pStyle w:val="Compact"/>
+            </w:pPr>
+            <w:r>
+              <w:t xml:space="preserve">A.1</w:t>
+            </w:r>
+          </w:p>
+        </w:tc>
+      </w:tr>
+      <w:tr>
+        <w:tc>
+          <w:tcPr/>
+          <w:p>
+            <w:pPr>
+              <w:pStyle w:val="Compact"/>
+            </w:pPr>
+            <w:r>
+              <w:t xml:space="preserve">3</w:t>
+            </w:r>
+          </w:p>
+        </w:tc>
+        <w:tc>
+          <w:tcPr/>
+          <w:p>
+            <w:pPr>
+              <w:pStyle w:val="Compact"/>
+            </w:pPr>
+            <w:r>
+              <w:t xml:space="preserve">A.1</w:t>
+            </w:r>
+          </w:p>
+        </w:tc>
+        <w:tc>
+          <w:tcPr/>
+          <w:p>
+            <w:pPr>
+              <w:pStyle w:val="Compact"/>
+            </w:pPr>
+            <w:r>
+              <w:t xml:space="preserve">A.1</w:t>
+            </w:r>
+          </w:p>
+        </w:tc>
+      </w:tr>
+      <w:tr>
+        <w:tc>
+          <w:tcPr/>
+          <w:p>
+            <w:pPr>
+              <w:pStyle w:val="Compact"/>
+            </w:pPr>
+            <w:r>
+              <w:t xml:space="preserve">4</w:t>
+            </w:r>
+          </w:p>
+        </w:tc>
+        <w:tc>
+          <w:tcPr/>
+          <w:p>
+            <w:pPr>
+              <w:pStyle w:val="Compact"/>
+            </w:pPr>
+            <w:r>
+              <w:t xml:space="preserve">A.1</w:t>
+            </w:r>
+          </w:p>
+        </w:tc>
+        <w:tc>
+          <w:tcPr/>
+          <w:p>
+            <w:pPr>
+              <w:pStyle w:val="Compact"/>
+            </w:pPr>
+            <w:r>
+              <w:t xml:space="preserve">A.1</w:t>
+            </w:r>
+          </w:p>
+        </w:tc>
+      </w:tr>
+      <w:tr>
+        <w:tc>
+          <w:tcPr/>
+          <w:p>
+            <w:pPr>
+              <w:pStyle w:val="Compact"/>
+            </w:pPr>
+            <w:r>
+              <w:t xml:space="preserve">5</w:t>
+            </w:r>
+          </w:p>
+        </w:tc>
+        <w:tc>
+          <w:tcPr/>
+          <w:p>
+            <w:pPr>
+              <w:pStyle w:val="Compact"/>
+            </w:pPr>
+            <w:r>
+              <w:t xml:space="preserve">A.1</w:t>
+            </w:r>
+          </w:p>
+        </w:tc>
+        <w:tc>
+          <w:tcPr/>
+          <w:p>
+            <w:pPr>
+              <w:pStyle w:val="Compact"/>
+            </w:pPr>
+            <w:r>
+              <w:t xml:space="preserve">A.1</w:t>
+            </w:r>
+          </w:p>
+        </w:tc>
+      </w:tr>
+    </w:tbl>
+    <w:p>
+      <w:pPr>
+        <w:pStyle w:val="Compact"/>
+        <w:numPr>
+          <w:ilvl w:val="0"/>
+          <w:numId w:val="1051"/>
+        </w:numPr>
+      </w:pPr>
+      <w:r>
+        <w:t xml:space="preserve">TEST Table 사이즈 조절</w:t>
+      </w:r>
+    </w:p>
+    <w:p>
+      <w:pPr>
+        <w:pStyle w:val="FirstParagraph"/>
+      </w:pPr>
+      <w:r>
+        <w:t xml:space="preserve">이 방법으로 도 사이즈 조절 가능</w:t>
+      </w:r>
+    </w:p>
+    <w:tbl>
+      <w:tblPr>
+        <w:tblStyle w:val="Table"/>
+        <w:tblW w:type="pct" w:w="3403"/>
+        <w:tblLayout w:type="fixed"/>
+        <w:tblLook w:firstRow="1" w:lastRow="0" w:firstColumn="0" w:lastColumn="0" w:noHBand="0" w:noVBand="0" w:val="0020"/>
+      </w:tblPr>
+      <w:tblGrid>
+        <w:gridCol w:w="770"/>
+        <w:gridCol w:w="1870"/>
+        <w:gridCol w:w="2750"/>
+      </w:tblGrid>
+      <w:tr>
+        <w:trPr>
+          <w:tblHeader w:val="on"/>
+        </w:trPr>
+        <w:tc>
+          <w:tcPr/>
+          <w:p>
+            <w:pPr>
+              <w:pStyle w:val="Compact"/>
+            </w:pPr>
+            <w:r>
+              <w:t xml:space="preserve">구분</w:t>
+            </w:r>
+          </w:p>
+        </w:tc>
+        <w:tc>
+          <w:tcPr/>
+          <w:p>
+            <w:pPr>
+              <w:pStyle w:val="Compact"/>
+            </w:pPr>
+            <w:r>
+              <w:t xml:space="preserve">A</w:t>
+            </w:r>
+          </w:p>
+        </w:tc>
+        <w:tc>
+          <w:tcPr/>
+          <w:p>
+            <w:pPr>
+              <w:pStyle w:val="Compact"/>
+            </w:pPr>
+            <w:r>
+              <w:t xml:space="preserve">B</w:t>
+            </w:r>
+          </w:p>
+        </w:tc>
+      </w:tr>
+      <w:tr>
+        <w:tc>
+          <w:tcPr/>
+          <w:p>
+            <w:pPr>
+              <w:pStyle w:val="Compact"/>
+            </w:pPr>
+            <w:r>
+              <w:t xml:space="preserve">1</w:t>
+            </w:r>
+          </w:p>
+        </w:tc>
+        <w:tc>
+          <w:tcPr/>
+          <w:p>
+            <w:pPr>
+              <w:pStyle w:val="Compact"/>
+            </w:pPr>
+            <w:r>
+              <w:t xml:space="preserve">A.1</w:t>
+            </w:r>
+          </w:p>
+        </w:tc>
+        <w:tc>
+          <w:tcPr/>
+          <w:p>
+            <w:pPr>
+              <w:pStyle w:val="Compact"/>
+            </w:pPr>
+            <w:r>
+              <w:t xml:space="preserve">A.1</w:t>
+            </w:r>
+          </w:p>
+        </w:tc>
+      </w:tr>
+      <w:tr>
+        <w:tc>
+          <w:tcPr/>
+          <w:p>
+            <w:pPr>
+              <w:pStyle w:val="Compact"/>
+            </w:pPr>
+            <w:r>
+              <w:t xml:space="preserve">2</w:t>
+            </w:r>
+          </w:p>
+        </w:tc>
+        <w:tc>
+          <w:tcPr/>
+          <w:p>
+            <w:pPr>
+              <w:pStyle w:val="Compact"/>
+            </w:pPr>
+            <w:r>
+              <w:t xml:space="preserve">A.2</w:t>
+            </w:r>
+          </w:p>
+        </w:tc>
+        <w:tc>
+          <w:tcPr/>
+          <w:p>
+            <w:pPr>
+              <w:pStyle w:val="Compact"/>
+            </w:pPr>
+            <w:r>
+              <w:t xml:space="preserve">A.1</w:t>
+            </w:r>
+          </w:p>
+        </w:tc>
+      </w:tr>
+      <w:tr>
+        <w:tc>
+          <w:tcPr/>
+          <w:p>
+            <w:pPr>
+              <w:pStyle w:val="Compact"/>
+            </w:pPr>
+            <w:r>
+              <w:t xml:space="preserve">3</w:t>
+            </w:r>
+          </w:p>
+        </w:tc>
+        <w:tc>
+          <w:tcPr/>
+          <w:p>
+            <w:pPr>
+              <w:pStyle w:val="Compact"/>
+            </w:pPr>
+            <w:r>
+              <w:t xml:space="preserve">A.1</w:t>
+            </w:r>
+          </w:p>
+        </w:tc>
+        <w:tc>
+          <w:tcPr/>
+          <w:p>
+            <w:pPr>
+              <w:pStyle w:val="Compact"/>
+            </w:pPr>
+            <w:r>
+              <w:t xml:space="preserve">A.1</w:t>
+            </w:r>
+          </w:p>
+        </w:tc>
+      </w:tr>
+      <w:tr>
+        <w:tc>
+          <w:tcPr/>
+          <w:p>
+            <w:pPr>
+              <w:pStyle w:val="Compact"/>
+            </w:pPr>
+            <w:r>
+              <w:t xml:space="preserve">4</w:t>
+            </w:r>
+          </w:p>
+        </w:tc>
+        <w:tc>
+          <w:tcPr/>
+          <w:p>
+            <w:pPr>
+              <w:pStyle w:val="Compact"/>
+            </w:pPr>
+            <w:r>
+              <w:t xml:space="preserve">A.1</w:t>
+            </w:r>
+          </w:p>
+        </w:tc>
+        <w:tc>
+          <w:tcPr/>
+          <w:p>
+            <w:pPr>
+              <w:pStyle w:val="Compact"/>
+            </w:pPr>
+            <w:r>
+              <w:t xml:space="preserve">A.1</w:t>
+            </w:r>
+          </w:p>
+        </w:tc>
+      </w:tr>
+      <w:tr>
+        <w:tc>
+          <w:tcPr/>
+          <w:p>
+            <w:pPr>
+              <w:pStyle w:val="Compact"/>
+            </w:pPr>
+            <w:r>
+              <w:t xml:space="preserve">5</w:t>
+            </w:r>
+          </w:p>
+        </w:tc>
+        <w:tc>
+          <w:tcPr/>
+          <w:p>
+            <w:pPr>
+              <w:pStyle w:val="Compact"/>
+            </w:pPr>
+            <w:r>
+              <w:t xml:space="preserve">A.1</w:t>
+            </w:r>
+          </w:p>
+        </w:tc>
+        <w:tc>
+          <w:tcPr/>
+          <w:p>
+            <w:pPr>
+              <w:pStyle w:val="Compact"/>
+            </w:pPr>
+            <w:r>
+              <w:t xml:space="preserve">A.1</w:t>
+            </w:r>
+          </w:p>
+        </w:tc>
+      </w:tr>
+    </w:tbl>
+    <w:p>
+      <w:pPr>
+        <w:pStyle w:val="a0"/>
+      </w:pPr>
+    </w:p>
+    <w:bookmarkEnd w:id="137"/>
+    <w:bookmarkStart w:id="138" w:name="pandoc-args"/>
+    <w:p>
+      <w:pPr>
+        <w:pStyle w:val="3"/>
+      </w:pPr>
+      <w:r>
+        <w:rPr>
+          <w:rStyle w:val="SectionNumber"/>
+        </w:rPr>
+        <w:t xml:space="preserve">7.5</w:t>
+      </w:r>
+      <w:r>
+        <w:tab/>
+      </w:r>
+      <w:r>
+        <w:t xml:space="preserve">Pandoc Args</w:t>
+      </w:r>
+    </w:p>
+    <w:p>
+      <w:pPr>
+        <w:pStyle w:val="FirstParagraph"/>
+      </w:pPr>
+    </w:p>
+    <w:p>
+      <w:pPr>
+        <w:pStyle w:val="Compact"/>
+        <w:numPr>
+          <w:ilvl w:val="0"/>
+          <w:numId w:val="1052"/>
+        </w:numPr>
+      </w:pPr>
+      <w:r>
+        <w:rPr>
+          <w:b/>
+          <w:bCs/>
+        </w:rPr>
         <w:t xml:space="preserve">VS Code Task</w:t>
       </w:r>
       <w:r>
@@ -4868,7 +5562,7 @@
         <w:rPr>
           <w:rStyle w:val="VerbatimChar"/>
         </w:rPr>
-        <w:t xml:space="preserve">                "--lua-filter=.\\docx\\lua\\information.lua",                </w:t>
+        <w:t xml:space="preserve">                "--lua-filter=.\\docx\\lua\\information.lua",  </w:t>
       </w:r>
       <w:r>
         <w:br/>
@@ -4877,6 +5571,15 @@
         <w:rPr>
           <w:rStyle w:val="VerbatimChar"/>
         </w:rPr>
+        <w:t xml:space="preserve">                "--lua-filter=.\\docx\\lua\\test_result.lua",                                </w:t>
+      </w:r>
+      <w:r>
+        <w:br/>
+      </w:r>
+      <w:r>
+        <w:rPr>
+          <w:rStyle w:val="VerbatimChar"/>
+        </w:rPr>
         <w:t xml:space="preserve">                "--reference-doc=.\\docx\\reference.docx",</w:t>
       </w:r>
       <w:r>
@@ -4907,8 +5610,8 @@
         <w:t xml:space="preserve">                ".\\docx\\tool_pandoc.docx"</w:t>
       </w:r>
     </w:p>
-    <w:bookmarkEnd w:id="134"/>
-    <w:bookmarkEnd w:id="135"/>
+    <w:bookmarkEnd w:id="138"/>
+    <w:bookmarkEnd w:id="139"/>
     <w:sectPr>
       <w:headerReference r:id="rId26" w:type="default"/>
       <w:footerReference r:id="rId27" w:type="default"/>
@@ -6019,9 +6722,45 @@
     <w:abstractNumId w:val="991"/>
   </w:num>
   <w:num w:numId="1048">
+    <w:abstractNumId w:val="99411"/>
+    <w:lvlOverride w:ilvl="0">
+      <w:startOverride w:val="1"/>
+    </w:lvlOverride>
+    <w:lvlOverride w:ilvl="1">
+      <w:startOverride w:val="1"/>
+    </w:lvlOverride>
+    <w:lvlOverride w:ilvl="2">
+      <w:startOverride w:val="1"/>
+    </w:lvlOverride>
+    <w:lvlOverride w:ilvl="3">
+      <w:startOverride w:val="1"/>
+    </w:lvlOverride>
+    <w:lvlOverride w:ilvl="4">
+      <w:startOverride w:val="1"/>
+    </w:lvlOverride>
+    <w:lvlOverride w:ilvl="5">
+      <w:startOverride w:val="1"/>
+    </w:lvlOverride>
+    <w:lvlOverride w:ilvl="6">
+      <w:startOverride w:val="1"/>
+    </w:lvlOverride>
+    <w:lvlOverride w:ilvl="7">
+      <w:startOverride w:val="1"/>
+    </w:lvlOverride>
+    <w:lvlOverride w:ilvl="8">
+      <w:startOverride w:val="1"/>
+    </w:lvlOverride>
+  </w:num>
+  <w:num w:numId="1049">
     <w:abstractNumId w:val="991"/>
   </w:num>
-  <w:num w:numId="1049">
+  <w:num w:numId="1050">
+    <w:abstractNumId w:val="991"/>
+  </w:num>
+  <w:num w:numId="1051">
+    <w:abstractNumId w:val="991"/>
+  </w:num>
+  <w:num w:numId="1052">
     <w:abstractNumId w:val="991"/>
   </w:num>
 </w:numbering>

</xml_diff>